<commit_message>
Plot δ-sweep as PPL ratio; tighten LLaMA §3.7 calibration disclosure
- §3.3, §3.7, §3.8: minor wording cleanups
- §3.7: tighten paraphrase paragraph
- §3.7: hedge LLaMA 1% FPR claim with explicit n_uwm=98 and 0/98 measured FPR
- Fig 5: plot PPL ratio (matches text); caption updated accordingly
- Demo cell 3: import WatermarkLogitsProcessor live + confirmation print
- Demo cell 5 panel (d): plot PPL ratio so demo and report agree on the quality metric
- Final_Report_Watermarking.docx regenerated from the updated main.tex
</commit_message>
<xml_diff>
--- a/Final_Report_Watermarking.docx
+++ b/Final_Report_Watermarking.docx
@@ -1894,7 +1894,7 @@
         </m:r>
       </m:oMath>
       <w:r>
-        <w:t xml:space="preserve">-test on the count of green tokens. Detection requires only the secret seed and the text, not access to the model.</w:t>
+        <w:t xml:space="preserve">-test on the count of green tokens.</w:t>
       </w:r>
     </w:p>
     <w:bookmarkEnd w:id="16"/>
@@ -2915,7 +2915,7 @@
         <w:t xml:space="preserve"> </w:t>
       </w:r>
       <w:r>
-        <w:t xml:space="preserve">signal is invisible at the surface, which is the design intent of the scheme.</w:t>
+        <w:t xml:space="preserve">signal is invisible at the surface, which is what the scheme is designed for.</w:t>
       </w:r>
     </w:p>
     <w:bookmarkStart w:id="24" w:name="fig:zscore"/>
@@ -2926,7 +2926,7 @@
       <w:r>
         <w:drawing>
           <wp:inline>
-            <wp:extent cx="5334000" cy="2078181"/>
+            <wp:extent cx="5334000" cy="2100919"/>
             <wp:effectExtent b="0" l="0" r="0" t="0"/>
             <wp:docPr descr="" title="" id="22" name="Picture"/>
             <a:graphic>
@@ -2947,7 +2947,7 @@
                   <pic:spPr bwMode="auto">
                     <a:xfrm>
                       <a:off x="0" y="0"/>
-                      <a:ext cx="5334000" cy="2078181"/>
+                      <a:ext cx="5334000" cy="2100919"/>
                     </a:xfrm>
                     <a:prstGeom prst="rect">
                       <a:avLst/>
@@ -4220,7 +4220,7 @@
         <w:t xml:space="preserve"> </w:t>
       </w:r>
       <w:r>
-        <w:t xml:space="preserve">unwatermarked). Blue: GPT-2 perplexity on watermarked completions. Knee at</w:t>
+        <w:t xml:space="preserve">unwatermarked). Blue: GPT-2 perplexity ratio of watermarked over unwatermarked completions on the same prompt subset. Knee at</w:t>
       </w:r>
       <w:r>
         <w:t xml:space="preserve"> </w:t>
@@ -4384,7 +4384,7 @@
         <w:t xml:space="preserve"> </w:t>
       </w:r>
       <w:r>
-        <w:t xml:space="preserve">on the full corpus (calibrated</w:t>
+        <w:t xml:space="preserve">on the full corpus (threshold</w:t>
       </w:r>
       <w:r>
         <w:t xml:space="preserve"> </w:t>
@@ -4404,6 +4404,62 @@
         </m:r>
       </m:oMath>
       <w:r>
+        <w:t xml:space="preserve"> </w:t>
+      </w:r>
+      <w:r>
+        <w:t xml:space="preserve">calibrated on</w:t>
+      </w:r>
+      <w:r>
+        <w:t xml:space="preserve"> </w:t>
+      </w:r>
+      <m:oMath>
+        <m:sSub>
+          <m:e>
+            <m:r>
+              <m:t>n</m:t>
+            </m:r>
+          </m:e>
+          <m:sub>
+            <m:r>
+              <m:rPr>
+                <m:nor/>
+                <m:sty m:val="p"/>
+              </m:rPr>
+              <m:t>uwm</m:t>
+            </m:r>
+          </m:sub>
+        </m:sSub>
+        <m:r>
+          <m:rPr>
+            <m:sty m:val="p"/>
+          </m:rPr>
+          <m:t>=</m:t>
+        </m:r>
+        <m:r>
+          <m:t>98</m:t>
+        </m:r>
+      </m:oMath>
+      <w:r>
+        <w:t xml:space="preserve">, with measured FPR</w:t>
+      </w:r>
+      <w:r>
+        <w:t xml:space="preserve"> </w:t>
+      </w:r>
+      <m:oMath>
+        <m:r>
+          <m:t>0</m:t>
+        </m:r>
+        <m:r>
+          <m:rPr>
+            <m:sty m:val="p"/>
+          </m:rPr>
+          <m:t>/</m:t>
+        </m:r>
+        <m:r>
+          <m:t>98</m:t>
+        </m:r>
+      </m:oMath>
+      <w:r>
         <w:t xml:space="preserve">), and the GPT-2 perplexity ratio is</w:t>
       </w:r>
       <w:r>
@@ -4535,7 +4591,7 @@
         <w:t xml:space="preserve"> </w:t>
       </w:r>
       <w:r>
-        <w:t xml:space="preserve">on Gemma. Crucially, under a full LLM-paraphrase attack in which LLaMA itself rewrites each watermarked completion with no logit processor active, TPR collapses to</w:t>
+        <w:t xml:space="preserve">on Gemma. Under a full LLM-paraphrase attack in which LLaMA itself rewrites each watermarked completion (no logit processor active), TPR collapses to</w:t>
       </w:r>
       <w:r>
         <w:t xml:space="preserve"> </w:t>
@@ -4801,7 +4857,7 @@
         <w:t xml:space="preserve"> </w:t>
       </w:r>
       <w:r>
-        <w:t xml:space="preserve">to a pre-multimodal release with uncertain compatibility, or constructing dummy image tensors. Both options sit outside the scope of a method paper on text watermarking. We substituted Gemma 2 9B (a text-only loader, distinct from LLaMA’s tokeniser) and documented the failure here so that future replicators can avoid the same dead end. This is a load-time tooling issue, not a watermark issue.</w:t>
+        <w:t xml:space="preserve">to a pre-multimodal release with uncertain compatibility, or constructing dummy image tensors. Both options fall outside the scope of this paper. We substituted Gemma 2 9B (a text-only loader, distinct from LLaMA’s tokeniser) and documented the failure here so that future replicators can avoid the same dead end. This is a load-time tooling issue, not a watermark issue.</w:t>
       </w:r>
     </w:p>
     <w:bookmarkEnd w:id="47"/>

</xml_diff>